<commit_message>
Se genera el PDF con los cambios finales
</commit_message>
<xml_diff>
--- a/docs/TPI_Documentacion_Base.docx
+++ b/docs/TPI_Documentacion_Base.docx
@@ -70,57 +70,50 @@
           <w:szCs w:val="22"/>
         </w:rPr>
       </w:pPr>
-      <w:r>
-        <w:rPr>
-          <w:rFonts w:ascii="Times New Roman" w:hAnsi="Times New Roman" w:cs="Times New Roman"/>
-          <w:sz w:val="22"/>
-          <w:szCs w:val="22"/>
-        </w:rPr>
-        <w:t>1. FUNDAMENTO Y CONTEXTO DE LA ORGANIZACIÓN</w:t>
-      </w:r>
-    </w:p>
-    <w:p>
-      <w:pPr>
-        <w:rPr>
-          <w:rFonts w:ascii="Times New Roman" w:hAnsi="Times New Roman" w:cs="Times New Roman"/>
-          <w:sz w:val="22"/>
-          <w:szCs w:val="22"/>
-        </w:rPr>
-      </w:pPr>
-    </w:p>
-    <w:p>
-      <w:pPr>
-        <w:rPr>
-          <w:rFonts w:ascii="Times New Roman" w:hAnsi="Times New Roman" w:cs="Times New Roman"/>
-          <w:sz w:val="22"/>
-          <w:szCs w:val="22"/>
-        </w:rPr>
-      </w:pPr>
-      <w:r>
-        <w:rPr>
-          <w:rFonts w:ascii="Times New Roman" w:hAnsi="Times New Roman" w:cs="Times New Roman"/>
-          <w:sz w:val="22"/>
-          <w:szCs w:val="22"/>
-        </w:rPr>
-        <w:t xml:space="preserve">Organización: </w:t>
-      </w:r>
-      <w:proofErr w:type="spellStart"/>
-      <w:r>
-        <w:rPr>
-          <w:rFonts w:ascii="Times New Roman" w:hAnsi="Times New Roman" w:cs="Times New Roman"/>
-          <w:sz w:val="22"/>
-          <w:szCs w:val="22"/>
-        </w:rPr>
-        <w:t>TechNova</w:t>
-      </w:r>
-      <w:proofErr w:type="spellEnd"/>
-      <w:r>
-        <w:rPr>
-          <w:rFonts w:ascii="Times New Roman" w:hAnsi="Times New Roman" w:cs="Times New Roman"/>
-          <w:sz w:val="22"/>
-          <w:szCs w:val="22"/>
-        </w:rPr>
-        <w:t xml:space="preserve"> Argentina.</w:t>
+    </w:p>
+    <w:p>
+      <w:pPr>
+        <w:rPr>
+          <w:rFonts w:ascii="Times New Roman" w:hAnsi="Times New Roman" w:cs="Times New Roman"/>
+          <w:sz w:val="22"/>
+          <w:szCs w:val="22"/>
+          <w:u w:val="single"/>
+        </w:rPr>
+      </w:pPr>
+      <w:r>
+        <w:rPr>
+          <w:rFonts w:ascii="Times New Roman" w:hAnsi="Times New Roman" w:cs="Times New Roman"/>
+          <w:sz w:val="22"/>
+          <w:szCs w:val="22"/>
+          <w:u w:val="single"/>
+        </w:rPr>
+        <w:t>FUNDAMENTO Y CONTEXTO DE LA ORGANIZACIÓN</w:t>
+      </w:r>
+    </w:p>
+    <w:p>
+      <w:pPr>
+        <w:rPr>
+          <w:rFonts w:ascii="Times New Roman" w:hAnsi="Times New Roman" w:cs="Times New Roman"/>
+          <w:sz w:val="22"/>
+          <w:szCs w:val="22"/>
+        </w:rPr>
+      </w:pPr>
+    </w:p>
+    <w:p>
+      <w:pPr>
+        <w:rPr>
+          <w:rFonts w:ascii="Times New Roman" w:hAnsi="Times New Roman" w:cs="Times New Roman"/>
+          <w:sz w:val="22"/>
+          <w:szCs w:val="22"/>
+        </w:rPr>
+      </w:pPr>
+      <w:r>
+        <w:rPr>
+          <w:rFonts w:ascii="Times New Roman" w:hAnsi="Times New Roman" w:cs="Times New Roman"/>
+          <w:sz w:val="22"/>
+          <w:szCs w:val="22"/>
+        </w:rPr>
+        <w:t>Organización: TechNova Argentina.</w:t>
       </w:r>
     </w:p>
     <w:p>
@@ -163,25 +156,15 @@
           <w:sz w:val="22"/>
           <w:szCs w:val="22"/>
         </w:rPr>
-        <w:t>Situación Actual (Proceso As-</w:t>
-      </w:r>
-      <w:proofErr w:type="spellStart"/>
-      <w:r>
-        <w:rPr>
-          <w:rFonts w:ascii="Times New Roman" w:hAnsi="Times New Roman" w:cs="Times New Roman"/>
-          <w:sz w:val="22"/>
-          <w:szCs w:val="22"/>
-        </w:rPr>
-        <w:t>Is</w:t>
-      </w:r>
-      <w:proofErr w:type="spellEnd"/>
-      <w:r>
-        <w:rPr>
-          <w:rFonts w:ascii="Times New Roman" w:hAnsi="Times New Roman" w:cs="Times New Roman"/>
-          <w:sz w:val="22"/>
-          <w:szCs w:val="22"/>
-        </w:rPr>
-        <w:t>):</w:t>
+        <w:t>Situación Actual</w:t>
+      </w:r>
+      <w:r>
+        <w:rPr>
+          <w:rFonts w:ascii="Times New Roman" w:hAnsi="Times New Roman" w:cs="Times New Roman"/>
+          <w:sz w:val="22"/>
+          <w:szCs w:val="22"/>
+        </w:rPr>
+        <w:t>:</w:t>
       </w:r>
     </w:p>
     <w:p>
@@ -292,6 +275,7 @@
           <w:rFonts w:ascii="Times New Roman" w:hAnsi="Times New Roman" w:cs="Times New Roman"/>
           <w:sz w:val="22"/>
           <w:szCs w:val="22"/>
+          <w:u w:val="single"/>
         </w:rPr>
       </w:pPr>
       <w:r>
@@ -301,7 +285,16 @@
           <w:szCs w:val="22"/>
         </w:rPr>
         <w:lastRenderedPageBreak/>
-        <w:t>2. PROPUESTA DE MEJORA Y AUTOMATIZACIÓN (PROCESO TO-BE)</w:t>
+        <w:t xml:space="preserve"> </w:t>
+      </w:r>
+      <w:r>
+        <w:rPr>
+          <w:rFonts w:ascii="Times New Roman" w:hAnsi="Times New Roman" w:cs="Times New Roman"/>
+          <w:sz w:val="22"/>
+          <w:szCs w:val="22"/>
+          <w:u w:val="single"/>
+        </w:rPr>
+        <w:t>PROPUESTA DE MEJORA Y AUTOMATIZACIÓN</w:t>
       </w:r>
       <w:r>
         <w:rPr>
@@ -309,6 +302,7 @@
           <w:noProof/>
           <w:sz w:val="22"/>
           <w:szCs w:val="22"/>
+          <w:u w:val="single"/>
         </w:rPr>
         <w:drawing>
           <wp:anchor distT="0" distB="0" distL="114300" distR="114300" simplePos="0" relativeHeight="251658240" behindDoc="1" locked="0" layoutInCell="1" allowOverlap="1" wp14:anchorId="2B0A6A5D" wp14:editId="02615EB7">
@@ -387,32 +381,6 @@
           <w:szCs w:val="22"/>
         </w:rPr>
       </w:pPr>
-      <w:r>
-        <w:rPr>
-          <w:rFonts w:ascii="Times New Roman" w:hAnsi="Times New Roman" w:cs="Times New Roman"/>
-          <w:sz w:val="22"/>
-          <w:szCs w:val="22"/>
-        </w:rPr>
-        <w:t>Para optimizar y estandarizar este flujo, se propone la implementación de un Asistente Virtual (</w:t>
-      </w:r>
-      <w:proofErr w:type="spellStart"/>
-      <w:r>
-        <w:rPr>
-          <w:rFonts w:ascii="Times New Roman" w:hAnsi="Times New Roman" w:cs="Times New Roman"/>
-          <w:sz w:val="22"/>
-          <w:szCs w:val="22"/>
-        </w:rPr>
-        <w:t>Chatbot</w:t>
-      </w:r>
-      <w:proofErr w:type="spellEnd"/>
-      <w:r>
-        <w:rPr>
-          <w:rFonts w:ascii="Times New Roman" w:hAnsi="Times New Roman" w:cs="Times New Roman"/>
-          <w:sz w:val="22"/>
-          <w:szCs w:val="22"/>
-        </w:rPr>
-        <w:t xml:space="preserve"> Web) que actuará como intermediario automatizado entre el empleado y la base de datos. El nuevo proceso funcionará de la siguiente manera:</w:t>
-      </w:r>
     </w:p>
     <w:p>
       <w:pPr>
@@ -429,25 +397,24 @@
           <w:szCs w:val="22"/>
         </w:rPr>
         <w:lastRenderedPageBreak/>
-        <w:t xml:space="preserve">- El empleado accede a la interfaz del </w:t>
-      </w:r>
-      <w:proofErr w:type="spellStart"/>
-      <w:r>
-        <w:rPr>
-          <w:rFonts w:ascii="Times New Roman" w:hAnsi="Times New Roman" w:cs="Times New Roman"/>
-          <w:sz w:val="22"/>
-          <w:szCs w:val="22"/>
-        </w:rPr>
-        <w:t>chatbot</w:t>
-      </w:r>
-      <w:proofErr w:type="spellEnd"/>
-      <w:r>
-        <w:rPr>
-          <w:rFonts w:ascii="Times New Roman" w:hAnsi="Times New Roman" w:cs="Times New Roman"/>
-          <w:sz w:val="22"/>
-          <w:szCs w:val="22"/>
-        </w:rPr>
-        <w:t xml:space="preserve"> e ingresa su número de DNI.</w:t>
+        <w:t>Para optimizar y estandarizar este flujo, se propone la implementación de un Asistente Virtual (Chatbot Web) que actuará como intermediario automatizado entre el empleado y la base de datos. El nuevo proceso funcionará de la siguiente manera:</w:t>
+      </w:r>
+    </w:p>
+    <w:p>
+      <w:pPr>
+        <w:rPr>
+          <w:rFonts w:ascii="Times New Roman" w:hAnsi="Times New Roman" w:cs="Times New Roman"/>
+          <w:sz w:val="22"/>
+          <w:szCs w:val="22"/>
+        </w:rPr>
+      </w:pPr>
+      <w:r>
+        <w:rPr>
+          <w:rFonts w:ascii="Times New Roman" w:hAnsi="Times New Roman" w:cs="Times New Roman"/>
+          <w:sz w:val="22"/>
+          <w:szCs w:val="22"/>
+        </w:rPr>
+        <w:t>- El empleado accede a la interfaz del chatbot e ingresa su número de DNI.</w:t>
       </w:r>
     </w:p>
     <w:p>
@@ -498,69 +465,35 @@
           <w:sz w:val="22"/>
           <w:szCs w:val="22"/>
         </w:rPr>
-        <w:t xml:space="preserve">- El sistema ejecuta una validación lógica mediante una compuerta de decisión: si los días solicitados son menores o iguales al saldo disponible, el </w:t>
-      </w:r>
-      <w:proofErr w:type="spellStart"/>
-      <w:r>
-        <w:rPr>
-          <w:rFonts w:ascii="Times New Roman" w:hAnsi="Times New Roman" w:cs="Times New Roman"/>
-          <w:sz w:val="22"/>
-          <w:szCs w:val="22"/>
-        </w:rPr>
-        <w:t>bot</w:t>
-      </w:r>
-      <w:proofErr w:type="spellEnd"/>
-      <w:r>
-        <w:rPr>
-          <w:rFonts w:ascii="Times New Roman" w:hAnsi="Times New Roman" w:cs="Times New Roman"/>
-          <w:sz w:val="22"/>
-          <w:szCs w:val="22"/>
-        </w:rPr>
-        <w:t xml:space="preserve"> aprueba la solicitud y actualiza la base de datos. Si la cantidad supera el saldo, el </w:t>
-      </w:r>
-      <w:proofErr w:type="spellStart"/>
-      <w:r>
-        <w:rPr>
-          <w:rFonts w:ascii="Times New Roman" w:hAnsi="Times New Roman" w:cs="Times New Roman"/>
-          <w:sz w:val="22"/>
-          <w:szCs w:val="22"/>
-        </w:rPr>
-        <w:t>bot</w:t>
-      </w:r>
-      <w:proofErr w:type="spellEnd"/>
-      <w:r>
-        <w:rPr>
-          <w:rFonts w:ascii="Times New Roman" w:hAnsi="Times New Roman" w:cs="Times New Roman"/>
-          <w:sz w:val="22"/>
-          <w:szCs w:val="22"/>
-        </w:rPr>
-        <w:t xml:space="preserve"> informa la restricción y solicita un nuevo ingreso.</w:t>
-      </w:r>
-    </w:p>
-    <w:p>
-      <w:pPr>
-        <w:rPr>
-          <w:rFonts w:ascii="Times New Roman" w:hAnsi="Times New Roman" w:cs="Times New Roman"/>
-          <w:sz w:val="22"/>
-          <w:szCs w:val="22"/>
-        </w:rPr>
-      </w:pPr>
-    </w:p>
-    <w:p>
-      <w:pPr>
-        <w:rPr>
-          <w:rFonts w:ascii="Times New Roman" w:hAnsi="Times New Roman" w:cs="Times New Roman"/>
-          <w:sz w:val="22"/>
-          <w:szCs w:val="22"/>
-        </w:rPr>
-      </w:pPr>
-      <w:r>
-        <w:rPr>
-          <w:rFonts w:ascii="Times New Roman" w:hAnsi="Times New Roman" w:cs="Times New Roman"/>
-          <w:sz w:val="22"/>
-          <w:szCs w:val="22"/>
-        </w:rPr>
-        <w:t>3. DICCIONARIO DE DATOS</w:t>
+        <w:t>- El sistema ejecuta una validación lógica mediante una compuerta de decisión: si los días solicitados son menores o iguales al saldo disponible, el bot aprueba la solicitud y actualiza la base de datos. Si la cantidad supera el saldo, el bot informa la restricción y solicita un nuevo ingreso.</w:t>
+      </w:r>
+    </w:p>
+    <w:p>
+      <w:pPr>
+        <w:rPr>
+          <w:rFonts w:ascii="Times New Roman" w:hAnsi="Times New Roman" w:cs="Times New Roman"/>
+          <w:sz w:val="22"/>
+          <w:szCs w:val="22"/>
+        </w:rPr>
+      </w:pPr>
+    </w:p>
+    <w:p>
+      <w:pPr>
+        <w:rPr>
+          <w:rFonts w:ascii="Times New Roman" w:hAnsi="Times New Roman" w:cs="Times New Roman"/>
+          <w:sz w:val="22"/>
+          <w:szCs w:val="22"/>
+          <w:u w:val="single"/>
+        </w:rPr>
+      </w:pPr>
+      <w:r>
+        <w:rPr>
+          <w:rFonts w:ascii="Times New Roman" w:hAnsi="Times New Roman" w:cs="Times New Roman"/>
+          <w:sz w:val="22"/>
+          <w:szCs w:val="22"/>
+          <w:u w:val="single"/>
+        </w:rPr>
+        <w:t>DICCIONARIO DE DATOS</w:t>
       </w:r>
     </w:p>
     <w:p>
@@ -603,475 +536,130 @@
           <w:sz w:val="22"/>
           <w:szCs w:val="22"/>
         </w:rPr>
-        <w:t xml:space="preserve">- </w:t>
-      </w:r>
-      <w:proofErr w:type="spellStart"/>
-      <w:r>
-        <w:rPr>
-          <w:rFonts w:ascii="Times New Roman" w:hAnsi="Times New Roman" w:cs="Times New Roman"/>
-          <w:sz w:val="22"/>
-          <w:szCs w:val="22"/>
-        </w:rPr>
-        <w:t>dni_empleado</w:t>
-      </w:r>
-      <w:proofErr w:type="spellEnd"/>
-      <w:r>
-        <w:rPr>
-          <w:rFonts w:ascii="Times New Roman" w:hAnsi="Times New Roman" w:cs="Times New Roman"/>
-          <w:sz w:val="22"/>
-          <w:szCs w:val="22"/>
-        </w:rPr>
-        <w:t>: (</w:t>
-      </w:r>
-      <w:proofErr w:type="spellStart"/>
-      <w:r>
-        <w:rPr>
-          <w:rFonts w:ascii="Times New Roman" w:hAnsi="Times New Roman" w:cs="Times New Roman"/>
-          <w:sz w:val="22"/>
-          <w:szCs w:val="22"/>
-        </w:rPr>
-        <w:t>Integer</w:t>
-      </w:r>
-      <w:proofErr w:type="spellEnd"/>
-      <w:r>
-        <w:rPr>
-          <w:rFonts w:ascii="Times New Roman" w:hAnsi="Times New Roman" w:cs="Times New Roman"/>
-          <w:sz w:val="22"/>
-          <w:szCs w:val="22"/>
-        </w:rPr>
-        <w:t>) Ingreso del Usuario. Identificador único del empleado.</w:t>
-      </w:r>
-    </w:p>
-    <w:p>
-      <w:pPr>
-        <w:rPr>
-          <w:rFonts w:ascii="Times New Roman" w:hAnsi="Times New Roman" w:cs="Times New Roman"/>
-          <w:sz w:val="22"/>
-          <w:szCs w:val="22"/>
-        </w:rPr>
-      </w:pPr>
-      <w:r>
-        <w:rPr>
-          <w:rFonts w:ascii="Times New Roman" w:hAnsi="Times New Roman" w:cs="Times New Roman"/>
-          <w:sz w:val="22"/>
-          <w:szCs w:val="22"/>
-        </w:rPr>
-        <w:t xml:space="preserve">- </w:t>
-      </w:r>
-      <w:proofErr w:type="spellStart"/>
-      <w:r>
-        <w:rPr>
-          <w:rFonts w:ascii="Times New Roman" w:hAnsi="Times New Roman" w:cs="Times New Roman"/>
-          <w:sz w:val="22"/>
-          <w:szCs w:val="22"/>
-        </w:rPr>
-        <w:t>nombre_empleado</w:t>
-      </w:r>
-      <w:proofErr w:type="spellEnd"/>
-      <w:r>
-        <w:rPr>
-          <w:rFonts w:ascii="Times New Roman" w:hAnsi="Times New Roman" w:cs="Times New Roman"/>
-          <w:sz w:val="22"/>
-          <w:szCs w:val="22"/>
-        </w:rPr>
-        <w:t>: (</w:t>
-      </w:r>
-      <w:proofErr w:type="spellStart"/>
-      <w:r>
-        <w:rPr>
-          <w:rFonts w:ascii="Times New Roman" w:hAnsi="Times New Roman" w:cs="Times New Roman"/>
-          <w:sz w:val="22"/>
-          <w:szCs w:val="22"/>
-        </w:rPr>
-        <w:t>String</w:t>
-      </w:r>
-      <w:proofErr w:type="spellEnd"/>
-      <w:r>
-        <w:rPr>
-          <w:rFonts w:ascii="Times New Roman" w:hAnsi="Times New Roman" w:cs="Times New Roman"/>
-          <w:sz w:val="22"/>
-          <w:szCs w:val="22"/>
-        </w:rPr>
-        <w:t>) Base de Datos. Nombre asociado al DNI.</w:t>
-      </w:r>
-    </w:p>
-    <w:p>
-      <w:pPr>
-        <w:rPr>
-          <w:rFonts w:ascii="Times New Roman" w:hAnsi="Times New Roman" w:cs="Times New Roman"/>
-          <w:sz w:val="22"/>
-          <w:szCs w:val="22"/>
-        </w:rPr>
-      </w:pPr>
-      <w:r>
-        <w:rPr>
-          <w:rFonts w:ascii="Times New Roman" w:hAnsi="Times New Roman" w:cs="Times New Roman"/>
-          <w:sz w:val="22"/>
-          <w:szCs w:val="22"/>
-        </w:rPr>
-        <w:t xml:space="preserve">- </w:t>
-      </w:r>
-      <w:proofErr w:type="spellStart"/>
-      <w:r>
-        <w:rPr>
-          <w:rFonts w:ascii="Times New Roman" w:hAnsi="Times New Roman" w:cs="Times New Roman"/>
-          <w:sz w:val="22"/>
-          <w:szCs w:val="22"/>
-        </w:rPr>
-        <w:t>saldo_vacaciones</w:t>
-      </w:r>
-      <w:proofErr w:type="spellEnd"/>
-      <w:r>
-        <w:rPr>
-          <w:rFonts w:ascii="Times New Roman" w:hAnsi="Times New Roman" w:cs="Times New Roman"/>
-          <w:sz w:val="22"/>
-          <w:szCs w:val="22"/>
-        </w:rPr>
-        <w:t>: (</w:t>
-      </w:r>
-      <w:proofErr w:type="spellStart"/>
-      <w:r>
-        <w:rPr>
-          <w:rFonts w:ascii="Times New Roman" w:hAnsi="Times New Roman" w:cs="Times New Roman"/>
-          <w:sz w:val="22"/>
-          <w:szCs w:val="22"/>
-        </w:rPr>
-        <w:t>Integer</w:t>
-      </w:r>
-      <w:proofErr w:type="spellEnd"/>
-      <w:r>
-        <w:rPr>
-          <w:rFonts w:ascii="Times New Roman" w:hAnsi="Times New Roman" w:cs="Times New Roman"/>
-          <w:sz w:val="22"/>
-          <w:szCs w:val="22"/>
-        </w:rPr>
-        <w:t>) Base de Datos. Días de licencia disponibles.</w:t>
-      </w:r>
-    </w:p>
-    <w:p>
-      <w:pPr>
-        <w:rPr>
-          <w:rFonts w:ascii="Times New Roman" w:hAnsi="Times New Roman" w:cs="Times New Roman"/>
-          <w:sz w:val="22"/>
-          <w:szCs w:val="22"/>
-        </w:rPr>
-      </w:pPr>
-      <w:r>
-        <w:rPr>
-          <w:rFonts w:ascii="Times New Roman" w:hAnsi="Times New Roman" w:cs="Times New Roman"/>
-          <w:sz w:val="22"/>
-          <w:szCs w:val="22"/>
-        </w:rPr>
-        <w:t xml:space="preserve">- </w:t>
-      </w:r>
-      <w:proofErr w:type="spellStart"/>
-      <w:r>
-        <w:rPr>
-          <w:rFonts w:ascii="Times New Roman" w:hAnsi="Times New Roman" w:cs="Times New Roman"/>
-          <w:sz w:val="22"/>
-          <w:szCs w:val="22"/>
-        </w:rPr>
-        <w:t>dias_solicitados</w:t>
-      </w:r>
-      <w:proofErr w:type="spellEnd"/>
-      <w:r>
-        <w:rPr>
-          <w:rFonts w:ascii="Times New Roman" w:hAnsi="Times New Roman" w:cs="Times New Roman"/>
-          <w:sz w:val="22"/>
-          <w:szCs w:val="22"/>
-        </w:rPr>
-        <w:t>: (</w:t>
-      </w:r>
-      <w:proofErr w:type="spellStart"/>
-      <w:r>
-        <w:rPr>
-          <w:rFonts w:ascii="Times New Roman" w:hAnsi="Times New Roman" w:cs="Times New Roman"/>
-          <w:sz w:val="22"/>
-          <w:szCs w:val="22"/>
-        </w:rPr>
-        <w:t>Integer</w:t>
-      </w:r>
-      <w:proofErr w:type="spellEnd"/>
-      <w:r>
-        <w:rPr>
-          <w:rFonts w:ascii="Times New Roman" w:hAnsi="Times New Roman" w:cs="Times New Roman"/>
-          <w:sz w:val="22"/>
-          <w:szCs w:val="22"/>
-        </w:rPr>
-        <w:t>) Ingreso del Usuario. Días que el empleado desea tomarse.</w:t>
-      </w:r>
-    </w:p>
-    <w:p>
-      <w:pPr>
-        <w:rPr>
-          <w:rFonts w:ascii="Times New Roman" w:hAnsi="Times New Roman" w:cs="Times New Roman"/>
-          <w:sz w:val="22"/>
-          <w:szCs w:val="22"/>
-        </w:rPr>
-      </w:pPr>
-      <w:r>
-        <w:rPr>
-          <w:rFonts w:ascii="Times New Roman" w:hAnsi="Times New Roman" w:cs="Times New Roman"/>
-          <w:sz w:val="22"/>
-          <w:szCs w:val="22"/>
-        </w:rPr>
-        <w:t xml:space="preserve">- </w:t>
-      </w:r>
-      <w:proofErr w:type="spellStart"/>
-      <w:r>
-        <w:rPr>
-          <w:rFonts w:ascii="Times New Roman" w:hAnsi="Times New Roman" w:cs="Times New Roman"/>
-          <w:sz w:val="22"/>
-          <w:szCs w:val="22"/>
-        </w:rPr>
-        <w:t>estado_solicitud</w:t>
-      </w:r>
-      <w:proofErr w:type="spellEnd"/>
-      <w:r>
-        <w:rPr>
-          <w:rFonts w:ascii="Times New Roman" w:hAnsi="Times New Roman" w:cs="Times New Roman"/>
-          <w:sz w:val="22"/>
-          <w:szCs w:val="22"/>
-        </w:rPr>
-        <w:t>: (</w:t>
-      </w:r>
-      <w:proofErr w:type="spellStart"/>
-      <w:r>
-        <w:rPr>
-          <w:rFonts w:ascii="Times New Roman" w:hAnsi="Times New Roman" w:cs="Times New Roman"/>
-          <w:sz w:val="22"/>
-          <w:szCs w:val="22"/>
-        </w:rPr>
-        <w:t>String</w:t>
-      </w:r>
-      <w:proofErr w:type="spellEnd"/>
-      <w:r>
-        <w:rPr>
-          <w:rFonts w:ascii="Times New Roman" w:hAnsi="Times New Roman" w:cs="Times New Roman"/>
-          <w:sz w:val="22"/>
-          <w:szCs w:val="22"/>
-        </w:rPr>
-        <w:t>) Sistema. Resultado de la validación ("Aprobada", "Rechazada").</w:t>
-      </w:r>
-    </w:p>
-    <w:p>
-      <w:pPr>
-        <w:rPr>
-          <w:rFonts w:ascii="Times New Roman" w:hAnsi="Times New Roman" w:cs="Times New Roman"/>
-          <w:sz w:val="22"/>
-          <w:szCs w:val="22"/>
-        </w:rPr>
-      </w:pPr>
-      <w:r>
-        <w:rPr>
-          <w:rFonts w:ascii="Times New Roman" w:hAnsi="Times New Roman" w:cs="Times New Roman"/>
-          <w:sz w:val="22"/>
-          <w:szCs w:val="22"/>
-        </w:rPr>
-        <w:t xml:space="preserve">- </w:t>
-      </w:r>
-      <w:proofErr w:type="spellStart"/>
-      <w:r>
-        <w:rPr>
-          <w:rFonts w:ascii="Times New Roman" w:hAnsi="Times New Roman" w:cs="Times New Roman"/>
-          <w:sz w:val="22"/>
-          <w:szCs w:val="22"/>
-        </w:rPr>
-        <w:t>estado_chatbot</w:t>
-      </w:r>
-      <w:proofErr w:type="spellEnd"/>
-      <w:r>
-        <w:rPr>
-          <w:rFonts w:ascii="Times New Roman" w:hAnsi="Times New Roman" w:cs="Times New Roman"/>
-          <w:sz w:val="22"/>
-          <w:szCs w:val="22"/>
-        </w:rPr>
-        <w:t>: (</w:t>
-      </w:r>
-      <w:proofErr w:type="spellStart"/>
-      <w:r>
-        <w:rPr>
-          <w:rFonts w:ascii="Times New Roman" w:hAnsi="Times New Roman" w:cs="Times New Roman"/>
-          <w:sz w:val="22"/>
-          <w:szCs w:val="22"/>
-        </w:rPr>
-        <w:t>String</w:t>
-      </w:r>
-      <w:proofErr w:type="spellEnd"/>
-      <w:r>
-        <w:rPr>
-          <w:rFonts w:ascii="Times New Roman" w:hAnsi="Times New Roman" w:cs="Times New Roman"/>
-          <w:sz w:val="22"/>
-          <w:szCs w:val="22"/>
-        </w:rPr>
-        <w:t xml:space="preserve">) Sistema (Memoria). Variable de control para la Máquina de Estados (ej. </w:t>
-      </w:r>
-      <w:proofErr w:type="spellStart"/>
-      <w:r>
-        <w:rPr>
-          <w:rFonts w:ascii="Times New Roman" w:hAnsi="Times New Roman" w:cs="Times New Roman"/>
-          <w:sz w:val="22"/>
-          <w:szCs w:val="22"/>
-        </w:rPr>
-        <w:t>esperando_dni</w:t>
-      </w:r>
-      <w:proofErr w:type="spellEnd"/>
-      <w:r>
-        <w:rPr>
-          <w:rFonts w:ascii="Times New Roman" w:hAnsi="Times New Roman" w:cs="Times New Roman"/>
-          <w:sz w:val="22"/>
-          <w:szCs w:val="22"/>
-        </w:rPr>
-        <w:t>).</w:t>
-      </w:r>
-    </w:p>
-    <w:p>
-      <w:pPr>
-        <w:rPr>
-          <w:rFonts w:ascii="Times New Roman" w:hAnsi="Times New Roman" w:cs="Times New Roman"/>
-          <w:sz w:val="22"/>
-          <w:szCs w:val="22"/>
-        </w:rPr>
-      </w:pPr>
-    </w:p>
-    <w:p>
-      <w:pPr>
-        <w:rPr>
-          <w:rFonts w:ascii="Times New Roman" w:hAnsi="Times New Roman" w:cs="Times New Roman"/>
-          <w:sz w:val="22"/>
-          <w:szCs w:val="22"/>
-        </w:rPr>
-      </w:pPr>
-      <w:r>
-        <w:rPr>
-          <w:rFonts w:ascii="Times New Roman" w:hAnsi="Times New Roman" w:cs="Times New Roman"/>
-          <w:sz w:val="22"/>
-          <w:szCs w:val="22"/>
-        </w:rPr>
-        <w:t>4. MANUAL DE USUARIO</w:t>
-      </w:r>
-    </w:p>
-    <w:p>
-      <w:pPr>
-        <w:rPr>
-          <w:rFonts w:ascii="Times New Roman" w:hAnsi="Times New Roman" w:cs="Times New Roman"/>
-          <w:sz w:val="22"/>
-          <w:szCs w:val="22"/>
-        </w:rPr>
-      </w:pPr>
-      <w:r>
-        <w:rPr>
-          <w:rFonts w:ascii="Times New Roman" w:hAnsi="Times New Roman" w:cs="Times New Roman"/>
-          <w:sz w:val="22"/>
-          <w:szCs w:val="22"/>
-        </w:rPr>
-        <w:t>[MANTENER TU TEXTO ACTUAL AQUÍ]</w:t>
-      </w:r>
-    </w:p>
-    <w:p>
-      <w:pPr>
-        <w:rPr>
-          <w:rFonts w:ascii="Times New Roman" w:hAnsi="Times New Roman" w:cs="Times New Roman"/>
-          <w:sz w:val="22"/>
-          <w:szCs w:val="22"/>
-        </w:rPr>
-      </w:pPr>
-    </w:p>
-    <w:p>
-      <w:pPr>
-        <w:rPr>
-          <w:rFonts w:ascii="Times New Roman" w:hAnsi="Times New Roman" w:cs="Times New Roman"/>
-          <w:sz w:val="22"/>
-          <w:szCs w:val="22"/>
-        </w:rPr>
-      </w:pPr>
-      <w:r>
-        <w:rPr>
-          <w:rFonts w:ascii="Times New Roman" w:hAnsi="Times New Roman" w:cs="Times New Roman"/>
-          <w:sz w:val="22"/>
-          <w:szCs w:val="22"/>
-        </w:rPr>
-        <w:t>5. PRUEBAS DE POSIBILIDAD DE ESTRÉS Y ROBUSTEZ (CAMINO INFELIZ)</w:t>
-      </w:r>
-    </w:p>
-    <w:p>
-      <w:pPr>
-        <w:rPr>
-          <w:rFonts w:ascii="Times New Roman" w:hAnsi="Times New Roman" w:cs="Times New Roman"/>
-          <w:sz w:val="22"/>
-          <w:szCs w:val="22"/>
-        </w:rPr>
-      </w:pPr>
-      <w:r>
-        <w:rPr>
-          <w:rFonts w:ascii="Times New Roman" w:hAnsi="Times New Roman" w:cs="Times New Roman"/>
-          <w:sz w:val="22"/>
-          <w:szCs w:val="22"/>
-        </w:rPr>
-        <w:t>[MANTENER TU TEXTO ACTUAL AQUÍ]</w:t>
-      </w:r>
-    </w:p>
-    <w:p>
-      <w:pPr>
-        <w:rPr>
-          <w:rFonts w:ascii="Times New Roman" w:hAnsi="Times New Roman" w:cs="Times New Roman"/>
-          <w:sz w:val="22"/>
-          <w:szCs w:val="22"/>
-        </w:rPr>
-      </w:pPr>
-    </w:p>
-    <w:p>
-      <w:pPr>
-        <w:rPr>
-          <w:rFonts w:ascii="Times New Roman" w:hAnsi="Times New Roman" w:cs="Times New Roman"/>
-          <w:sz w:val="22"/>
-          <w:szCs w:val="22"/>
-        </w:rPr>
-      </w:pPr>
-      <w:r>
-        <w:rPr>
-          <w:rFonts w:ascii="Times New Roman" w:hAnsi="Times New Roman" w:cs="Times New Roman"/>
-          <w:sz w:val="22"/>
-          <w:szCs w:val="22"/>
-        </w:rPr>
-        <w:t>6. PERSPECTIVA TÉCNICA Y HERRAMIENTAS</w:t>
-      </w:r>
-    </w:p>
-    <w:p>
-      <w:pPr>
-        <w:rPr>
-          <w:rFonts w:ascii="Times New Roman" w:hAnsi="Times New Roman" w:cs="Times New Roman"/>
-          <w:sz w:val="22"/>
-          <w:szCs w:val="22"/>
-        </w:rPr>
-      </w:pPr>
-    </w:p>
-    <w:p>
-      <w:pPr>
-        <w:rPr>
-          <w:rFonts w:ascii="Times New Roman" w:hAnsi="Times New Roman" w:cs="Times New Roman"/>
-          <w:sz w:val="22"/>
-          <w:szCs w:val="22"/>
-        </w:rPr>
-      </w:pPr>
-      <w:r>
-        <w:rPr>
-          <w:rFonts w:ascii="Times New Roman" w:hAnsi="Times New Roman" w:cs="Times New Roman"/>
-          <w:sz w:val="22"/>
-          <w:szCs w:val="22"/>
-        </w:rPr>
-        <w:t xml:space="preserve">Plataforma y Lenguaje: El sistema fue desarrollado en Python utilizando el </w:t>
-      </w:r>
-      <w:proofErr w:type="spellStart"/>
-      <w:r>
-        <w:rPr>
-          <w:rFonts w:ascii="Times New Roman" w:hAnsi="Times New Roman" w:cs="Times New Roman"/>
-          <w:sz w:val="22"/>
-          <w:szCs w:val="22"/>
-        </w:rPr>
-        <w:t>framework</w:t>
-      </w:r>
-      <w:proofErr w:type="spellEnd"/>
+        <w:t>- dni_empleado: (Integer) Ingreso del Usuario. Identificador único del empleado.</w:t>
+      </w:r>
+    </w:p>
+    <w:p>
+      <w:pPr>
+        <w:rPr>
+          <w:rFonts w:ascii="Times New Roman" w:hAnsi="Times New Roman" w:cs="Times New Roman"/>
+          <w:sz w:val="22"/>
+          <w:szCs w:val="22"/>
+        </w:rPr>
+      </w:pPr>
+      <w:r>
+        <w:rPr>
+          <w:rFonts w:ascii="Times New Roman" w:hAnsi="Times New Roman" w:cs="Times New Roman"/>
+          <w:sz w:val="22"/>
+          <w:szCs w:val="22"/>
+        </w:rPr>
+        <w:t>- nombre_empleado: (String) Base de Datos. Nombre asociado al DNI.</w:t>
+      </w:r>
+    </w:p>
+    <w:p>
+      <w:pPr>
+        <w:rPr>
+          <w:rFonts w:ascii="Times New Roman" w:hAnsi="Times New Roman" w:cs="Times New Roman"/>
+          <w:sz w:val="22"/>
+          <w:szCs w:val="22"/>
+        </w:rPr>
+      </w:pPr>
+      <w:r>
+        <w:rPr>
+          <w:rFonts w:ascii="Times New Roman" w:hAnsi="Times New Roman" w:cs="Times New Roman"/>
+          <w:sz w:val="22"/>
+          <w:szCs w:val="22"/>
+        </w:rPr>
+        <w:t>- saldo_vacaciones: (Integer) Base de Datos. Días de licencia disponibles.</w:t>
+      </w:r>
+    </w:p>
+    <w:p>
+      <w:pPr>
+        <w:rPr>
+          <w:rFonts w:ascii="Times New Roman" w:hAnsi="Times New Roman" w:cs="Times New Roman"/>
+          <w:sz w:val="22"/>
+          <w:szCs w:val="22"/>
+        </w:rPr>
+      </w:pPr>
+      <w:r>
+        <w:rPr>
+          <w:rFonts w:ascii="Times New Roman" w:hAnsi="Times New Roman" w:cs="Times New Roman"/>
+          <w:sz w:val="22"/>
+          <w:szCs w:val="22"/>
+        </w:rPr>
+        <w:t>- dias_solicitados: (Integer) Ingreso del Usuario. Días que el empleado desea tomarse.</w:t>
+      </w:r>
+    </w:p>
+    <w:p>
+      <w:pPr>
+        <w:rPr>
+          <w:rFonts w:ascii="Times New Roman" w:hAnsi="Times New Roman" w:cs="Times New Roman"/>
+          <w:sz w:val="22"/>
+          <w:szCs w:val="22"/>
+        </w:rPr>
+      </w:pPr>
+      <w:r>
+        <w:rPr>
+          <w:rFonts w:ascii="Times New Roman" w:hAnsi="Times New Roman" w:cs="Times New Roman"/>
+          <w:sz w:val="22"/>
+          <w:szCs w:val="22"/>
+        </w:rPr>
+        <w:t>- estado_solicitud: (String) Sistema. Resultado de la validación ("Aprobada", "Rechazada").</w:t>
+      </w:r>
+    </w:p>
+    <w:p>
+      <w:pPr>
+        <w:rPr>
+          <w:rFonts w:ascii="Times New Roman" w:hAnsi="Times New Roman" w:cs="Times New Roman"/>
+          <w:sz w:val="22"/>
+          <w:szCs w:val="22"/>
+        </w:rPr>
+      </w:pPr>
+      <w:r>
+        <w:rPr>
+          <w:rFonts w:ascii="Times New Roman" w:hAnsi="Times New Roman" w:cs="Times New Roman"/>
+          <w:sz w:val="22"/>
+          <w:szCs w:val="22"/>
+        </w:rPr>
+        <w:t>- estado_chatbot: (String) Sistema (Memoria). Variable de control para la Máquina de Estados (ej. esperando_dni).</w:t>
+      </w:r>
+    </w:p>
+    <w:p>
+      <w:pPr>
+        <w:rPr>
+          <w:rFonts w:ascii="Times New Roman" w:hAnsi="Times New Roman" w:cs="Times New Roman"/>
+          <w:sz w:val="22"/>
+          <w:szCs w:val="22"/>
+        </w:rPr>
+      </w:pPr>
+    </w:p>
+    <w:p>
+      <w:pPr>
+        <w:rPr>
+          <w:rFonts w:ascii="Times New Roman" w:hAnsi="Times New Roman" w:cs="Times New Roman"/>
+          <w:sz w:val="22"/>
+          <w:szCs w:val="22"/>
+          <w:u w:val="single"/>
+        </w:rPr>
+      </w:pPr>
+      <w:r>
+        <w:rPr>
+          <w:rFonts w:ascii="Times New Roman" w:hAnsi="Times New Roman" w:cs="Times New Roman"/>
+          <w:sz w:val="22"/>
+          <w:szCs w:val="22"/>
+          <w:u w:val="single"/>
+        </w:rPr>
+        <w:t>MANUAL DE USUARIO</w:t>
+      </w:r>
+    </w:p>
+    <w:p>
+      <w:pPr>
+        <w:rPr>
+          <w:rFonts w:ascii="Times New Roman" w:hAnsi="Times New Roman" w:cs="Times New Roman"/>
+          <w:sz w:val="22"/>
+          <w:szCs w:val="22"/>
+        </w:rPr>
+      </w:pPr>
       <w:r>
         <w:rPr>
           <w:rFonts w:ascii="Times New Roman" w:hAnsi="Times New Roman" w:cs="Times New Roman"/>
@@ -1080,23 +668,291 @@
         </w:rPr>
         <w:t xml:space="preserve"> </w:t>
       </w:r>
-      <w:proofErr w:type="spellStart"/>
-      <w:r>
-        <w:rPr>
-          <w:rFonts w:ascii="Times New Roman" w:hAnsi="Times New Roman" w:cs="Times New Roman"/>
-          <w:sz w:val="22"/>
-          <w:szCs w:val="22"/>
-        </w:rPr>
-        <w:t>Streamlit</w:t>
-      </w:r>
-      <w:proofErr w:type="spellEnd"/>
-      <w:r>
-        <w:rPr>
-          <w:rFonts w:ascii="Times New Roman" w:hAnsi="Times New Roman" w:cs="Times New Roman"/>
-          <w:sz w:val="22"/>
-          <w:szCs w:val="22"/>
-        </w:rPr>
-        <w:t>, permitiendo una implementación rápida de la interfaz gráfica web y la lógica de negocio.</w:t>
+      <w:r>
+        <w:rPr>
+          <w:rFonts w:ascii="Times New Roman" w:hAnsi="Times New Roman" w:cs="Times New Roman"/>
+          <w:sz w:val="22"/>
+          <w:szCs w:val="22"/>
+        </w:rPr>
+        <w:t xml:space="preserve">Asistente Virtual cuenta con una interfaz web simplificada. Los pasos para su utilización son: </w:t>
+      </w:r>
+    </w:p>
+    <w:p>
+      <w:pPr>
+        <w:rPr>
+          <w:rFonts w:ascii="Times New Roman" w:hAnsi="Times New Roman" w:cs="Times New Roman"/>
+          <w:sz w:val="22"/>
+          <w:szCs w:val="22"/>
+        </w:rPr>
+      </w:pPr>
+      <w:r>
+        <w:rPr>
+          <w:rFonts w:ascii="Times New Roman" w:hAnsi="Times New Roman" w:cs="Times New Roman"/>
+          <w:sz w:val="22"/>
+          <w:szCs w:val="22"/>
+        </w:rPr>
+        <w:t xml:space="preserve">1. Acceder a la URL de la aplicación. </w:t>
+      </w:r>
+    </w:p>
+    <w:p>
+      <w:pPr>
+        <w:rPr>
+          <w:rFonts w:ascii="Times New Roman" w:hAnsi="Times New Roman" w:cs="Times New Roman"/>
+          <w:sz w:val="22"/>
+          <w:szCs w:val="22"/>
+        </w:rPr>
+      </w:pPr>
+      <w:r>
+        <w:rPr>
+          <w:rFonts w:ascii="Times New Roman" w:hAnsi="Times New Roman" w:cs="Times New Roman"/>
+          <w:sz w:val="22"/>
+          <w:szCs w:val="22"/>
+        </w:rPr>
+        <w:t xml:space="preserve">2. En la pantalla de inicio, el sistema solicitará el "DNI del empleado". Se debe ingresar un número válido de la nómina. </w:t>
+      </w:r>
+    </w:p>
+    <w:p>
+      <w:pPr>
+        <w:rPr>
+          <w:rFonts w:ascii="Times New Roman" w:hAnsi="Times New Roman" w:cs="Times New Roman"/>
+          <w:sz w:val="22"/>
+          <w:szCs w:val="22"/>
+        </w:rPr>
+      </w:pPr>
+      <w:r>
+        <w:rPr>
+          <w:rFonts w:ascii="Times New Roman" w:hAnsi="Times New Roman" w:cs="Times New Roman"/>
+          <w:sz w:val="22"/>
+          <w:szCs w:val="22"/>
+        </w:rPr>
+        <w:t xml:space="preserve">3. Al presionar "Enviar", el sistema mostrará el nombre del empleado y su saldo de días disponibles. </w:t>
+      </w:r>
+    </w:p>
+    <w:p>
+      <w:pPr>
+        <w:rPr>
+          <w:rFonts w:ascii="Times New Roman" w:hAnsi="Times New Roman" w:cs="Times New Roman"/>
+          <w:sz w:val="22"/>
+          <w:szCs w:val="22"/>
+        </w:rPr>
+      </w:pPr>
+      <w:r>
+        <w:rPr>
+          <w:rFonts w:ascii="Times New Roman" w:hAnsi="Times New Roman" w:cs="Times New Roman"/>
+          <w:sz w:val="22"/>
+          <w:szCs w:val="22"/>
+        </w:rPr>
+        <w:t xml:space="preserve">4. Se habilitará un nuevo campo donde se debe ingresar la cantidad de días de licencia a solicitar (números enteros mayores a 0). </w:t>
+      </w:r>
+    </w:p>
+    <w:p>
+      <w:pPr>
+        <w:rPr>
+          <w:rFonts w:ascii="Times New Roman" w:hAnsi="Times New Roman" w:cs="Times New Roman"/>
+          <w:sz w:val="22"/>
+          <w:szCs w:val="22"/>
+        </w:rPr>
+      </w:pPr>
+      <w:r>
+        <w:rPr>
+          <w:rFonts w:ascii="Times New Roman" w:hAnsi="Times New Roman" w:cs="Times New Roman"/>
+          <w:sz w:val="22"/>
+          <w:szCs w:val="22"/>
+        </w:rPr>
+        <w:t>5. Al presionar "Solicitar Vacaciones", el sistema confirmará la aprobación mediante una alerta exitosa y actualizará la base de datos, o indicará un error si no se cumplen las reglas de negocio.</w:t>
+      </w:r>
+    </w:p>
+    <w:p>
+      <w:pPr>
+        <w:rPr>
+          <w:rFonts w:ascii="Times New Roman" w:hAnsi="Times New Roman" w:cs="Times New Roman"/>
+          <w:sz w:val="22"/>
+          <w:szCs w:val="22"/>
+        </w:rPr>
+      </w:pPr>
+    </w:p>
+    <w:p>
+      <w:pPr>
+        <w:rPr>
+          <w:rFonts w:ascii="Times New Roman" w:hAnsi="Times New Roman" w:cs="Times New Roman"/>
+          <w:sz w:val="22"/>
+          <w:szCs w:val="22"/>
+        </w:rPr>
+      </w:pPr>
+    </w:p>
+    <w:p>
+      <w:pPr>
+        <w:rPr>
+          <w:rFonts w:ascii="Times New Roman" w:hAnsi="Times New Roman" w:cs="Times New Roman"/>
+          <w:sz w:val="22"/>
+          <w:szCs w:val="22"/>
+          <w:u w:val="single"/>
+        </w:rPr>
+      </w:pPr>
+      <w:r>
+        <w:rPr>
+          <w:rFonts w:ascii="Times New Roman" w:hAnsi="Times New Roman" w:cs="Times New Roman"/>
+          <w:sz w:val="22"/>
+          <w:szCs w:val="22"/>
+          <w:u w:val="single"/>
+        </w:rPr>
+        <w:t>PRUEBAS DE POSIBILIDAD DE ESTRÉS Y ROBUSTEZ (CAMINO INFELIZ)</w:t>
+      </w:r>
+    </w:p>
+    <w:p>
+      <w:pPr>
+        <w:rPr>
+          <w:rFonts w:ascii="Times New Roman" w:hAnsi="Times New Roman" w:cs="Times New Roman"/>
+          <w:sz w:val="22"/>
+          <w:szCs w:val="22"/>
+        </w:rPr>
+      </w:pPr>
+    </w:p>
+    <w:p>
+      <w:pPr>
+        <w:rPr>
+          <w:rFonts w:ascii="Times New Roman" w:hAnsi="Times New Roman" w:cs="Times New Roman"/>
+          <w:sz w:val="22"/>
+          <w:szCs w:val="22"/>
+        </w:rPr>
+      </w:pPr>
+      <w:r>
+        <w:rPr>
+          <w:rFonts w:ascii="Times New Roman" w:hAnsi="Times New Roman" w:cs="Times New Roman"/>
+          <w:sz w:val="22"/>
+          <w:szCs w:val="22"/>
+        </w:rPr>
+        <w:t xml:space="preserve"> </w:t>
+      </w:r>
+      <w:r>
+        <w:rPr>
+          <w:rFonts w:ascii="Times New Roman" w:hAnsi="Times New Roman" w:cs="Times New Roman"/>
+          <w:sz w:val="22"/>
+          <w:szCs w:val="22"/>
+        </w:rPr>
+        <w:t xml:space="preserve">Para garantizar la robustez del sistema, se programaron validaciones que evitan la caída de la aplicación ante errores de ingreso: </w:t>
+      </w:r>
+    </w:p>
+    <w:p>
+      <w:pPr>
+        <w:rPr>
+          <w:rFonts w:ascii="Times New Roman" w:hAnsi="Times New Roman" w:cs="Times New Roman"/>
+          <w:sz w:val="22"/>
+          <w:szCs w:val="22"/>
+        </w:rPr>
+      </w:pPr>
+      <w:r>
+        <w:rPr>
+          <w:rFonts w:ascii="Times New Roman" w:hAnsi="Times New Roman" w:cs="Times New Roman"/>
+          <w:sz w:val="22"/>
+          <w:szCs w:val="22"/>
+        </w:rPr>
+        <w:t xml:space="preserve">- Validación de Tipo de Dato: Si el usuario ingresa caracteres alfanuméricos en el campo del DNI, el sistema captura el error y detiene el flujo solicitando un ingreso numérico válido. </w:t>
+      </w:r>
+    </w:p>
+    <w:p>
+      <w:pPr>
+        <w:rPr>
+          <w:rFonts w:ascii="Times New Roman" w:hAnsi="Times New Roman" w:cs="Times New Roman"/>
+          <w:sz w:val="22"/>
+          <w:szCs w:val="22"/>
+        </w:rPr>
+      </w:pPr>
+      <w:r>
+        <w:rPr>
+          <w:rFonts w:ascii="Times New Roman" w:hAnsi="Times New Roman" w:cs="Times New Roman"/>
+          <w:sz w:val="22"/>
+          <w:szCs w:val="22"/>
+        </w:rPr>
+        <w:t xml:space="preserve">- Validación de Existencia: Si se ingresa un DNI numérico que no figura en la nómina (archivo CSV), el sistema notifica que el usuario no fue encontrado y no permite avanzar al paso de solicitud. </w:t>
+      </w:r>
+    </w:p>
+    <w:p>
+      <w:pPr>
+        <w:rPr>
+          <w:rFonts w:ascii="Times New Roman" w:hAnsi="Times New Roman" w:cs="Times New Roman"/>
+          <w:sz w:val="22"/>
+          <w:szCs w:val="22"/>
+        </w:rPr>
+      </w:pPr>
+      <w:r>
+        <w:rPr>
+          <w:rFonts w:ascii="Times New Roman" w:hAnsi="Times New Roman" w:cs="Times New Roman"/>
+          <w:sz w:val="22"/>
+          <w:szCs w:val="22"/>
+        </w:rPr>
+        <w:t>- Compuerta de Saldo Insuficiente: Se configuró una decisión lógica (Gateway) que evalúa los días solicitados contra el saldo disponible. Si un empleado solicita una cantidad mayor a su saldo, el sistema ejecuta la rama de rechazo, muestra el mensaje "Error: Saldo insuficiente" y requiere un nuevo ingreso, demostrando la capacidad del bot de manejar excepciones sin romper su ejecución.</w:t>
+      </w:r>
+    </w:p>
+    <w:p>
+      <w:pPr>
+        <w:rPr>
+          <w:rFonts w:ascii="Times New Roman" w:hAnsi="Times New Roman" w:cs="Times New Roman"/>
+          <w:sz w:val="22"/>
+          <w:szCs w:val="22"/>
+        </w:rPr>
+      </w:pPr>
+    </w:p>
+    <w:p>
+      <w:pPr>
+        <w:rPr>
+          <w:rFonts w:ascii="Times New Roman" w:hAnsi="Times New Roman" w:cs="Times New Roman"/>
+          <w:sz w:val="22"/>
+          <w:szCs w:val="22"/>
+        </w:rPr>
+      </w:pPr>
+    </w:p>
+    <w:p>
+      <w:pPr>
+        <w:rPr>
+          <w:rFonts w:ascii="Times New Roman" w:hAnsi="Times New Roman" w:cs="Times New Roman"/>
+          <w:sz w:val="22"/>
+          <w:szCs w:val="22"/>
+          <w:u w:val="single"/>
+        </w:rPr>
+      </w:pPr>
+      <w:r>
+        <w:rPr>
+          <w:rFonts w:ascii="Times New Roman" w:hAnsi="Times New Roman" w:cs="Times New Roman"/>
+          <w:sz w:val="22"/>
+          <w:szCs w:val="22"/>
+          <w:u w:val="single"/>
+        </w:rPr>
+        <w:t>PERSPECTIVA TÉCNICA Y HERRAMIENTAS</w:t>
+      </w:r>
+    </w:p>
+    <w:p>
+      <w:pPr>
+        <w:rPr>
+          <w:rFonts w:ascii="Times New Roman" w:hAnsi="Times New Roman" w:cs="Times New Roman"/>
+          <w:sz w:val="22"/>
+          <w:szCs w:val="22"/>
+        </w:rPr>
+      </w:pPr>
+    </w:p>
+    <w:p>
+      <w:pPr>
+        <w:rPr>
+          <w:rFonts w:ascii="Times New Roman" w:hAnsi="Times New Roman" w:cs="Times New Roman"/>
+          <w:sz w:val="22"/>
+          <w:szCs w:val="22"/>
+        </w:rPr>
+      </w:pPr>
+      <w:r>
+        <w:rPr>
+          <w:rFonts w:ascii="Times New Roman" w:hAnsi="Times New Roman" w:cs="Times New Roman"/>
+          <w:sz w:val="22"/>
+          <w:szCs w:val="22"/>
+        </w:rPr>
+        <w:t xml:space="preserve"> </w:t>
+      </w:r>
+      <w:r>
+        <w:rPr>
+          <w:rFonts w:ascii="Times New Roman" w:hAnsi="Times New Roman" w:cs="Times New Roman"/>
+          <w:sz w:val="22"/>
+          <w:szCs w:val="22"/>
+        </w:rPr>
+        <w:t>Plataforma y Lenguaje: El sistema fue desarrollado en Python utilizando el framework Streamlit, permitiendo una implementación rápida de la interfaz gráfica web y la lógica de negocio.</w:t>
       </w:r>
     </w:p>
     <w:p>
@@ -1130,26 +986,7 @@
           <w:sz w:val="22"/>
           <w:szCs w:val="22"/>
         </w:rPr>
-        <w:lastRenderedPageBreak/>
-        <w:t xml:space="preserve">Gestión de Estados: Se implementó una Máquina de Estados, garantizando que el </w:t>
-      </w:r>
-      <w:proofErr w:type="spellStart"/>
-      <w:r>
-        <w:rPr>
-          <w:rFonts w:ascii="Times New Roman" w:hAnsi="Times New Roman" w:cs="Times New Roman"/>
-          <w:sz w:val="22"/>
-          <w:szCs w:val="22"/>
-        </w:rPr>
-        <w:t>bot</w:t>
-      </w:r>
-      <w:proofErr w:type="spellEnd"/>
-      <w:r>
-        <w:rPr>
-          <w:rFonts w:ascii="Times New Roman" w:hAnsi="Times New Roman" w:cs="Times New Roman"/>
-          <w:sz w:val="22"/>
-          <w:szCs w:val="22"/>
-        </w:rPr>
-        <w:t xml:space="preserve"> sepa en qué paso del proceso se encuentra cada usuario.</w:t>
+        <w:t>Gestión de Estados: Se implementó una Máquina de Estados, garantizando que el bot sepa en qué paso del proceso se encuentra cada usuario.</w:t>
       </w:r>
     </w:p>
     <w:p>
@@ -1186,13 +1023,78 @@
           <w:szCs w:val="22"/>
         </w:rPr>
       </w:pPr>
-      <w:r>
-        <w:rPr>
-          <w:rFonts w:ascii="Times New Roman" w:hAnsi="Times New Roman" w:cs="Times New Roman"/>
-          <w:sz w:val="22"/>
-          <w:szCs w:val="22"/>
-        </w:rPr>
-        <w:t>7. CONSULTAS A HERRAMIENTAS DE IA</w:t>
+    </w:p>
+    <w:p>
+      <w:pPr>
+        <w:rPr>
+          <w:rFonts w:ascii="Times New Roman" w:hAnsi="Times New Roman" w:cs="Times New Roman"/>
+          <w:sz w:val="22"/>
+          <w:szCs w:val="22"/>
+        </w:rPr>
+      </w:pPr>
+    </w:p>
+    <w:p>
+      <w:pPr>
+        <w:rPr>
+          <w:rFonts w:ascii="Times New Roman" w:hAnsi="Times New Roman" w:cs="Times New Roman"/>
+          <w:sz w:val="22"/>
+          <w:szCs w:val="22"/>
+        </w:rPr>
+      </w:pPr>
+    </w:p>
+    <w:p>
+      <w:pPr>
+        <w:rPr>
+          <w:rFonts w:ascii="Times New Roman" w:hAnsi="Times New Roman" w:cs="Times New Roman"/>
+          <w:sz w:val="22"/>
+          <w:szCs w:val="22"/>
+        </w:rPr>
+      </w:pPr>
+    </w:p>
+    <w:p>
+      <w:pPr>
+        <w:rPr>
+          <w:rFonts w:ascii="Times New Roman" w:hAnsi="Times New Roman" w:cs="Times New Roman"/>
+          <w:sz w:val="22"/>
+          <w:szCs w:val="22"/>
+        </w:rPr>
+      </w:pPr>
+    </w:p>
+    <w:p>
+      <w:pPr>
+        <w:rPr>
+          <w:rFonts w:ascii="Times New Roman" w:hAnsi="Times New Roman" w:cs="Times New Roman"/>
+          <w:sz w:val="22"/>
+          <w:szCs w:val="22"/>
+        </w:rPr>
+      </w:pPr>
+    </w:p>
+    <w:p>
+      <w:pPr>
+        <w:rPr>
+          <w:rFonts w:ascii="Times New Roman" w:hAnsi="Times New Roman" w:cs="Times New Roman"/>
+          <w:sz w:val="22"/>
+          <w:szCs w:val="22"/>
+        </w:rPr>
+      </w:pPr>
+    </w:p>
+    <w:p>
+      <w:pPr>
+        <w:rPr>
+          <w:rFonts w:ascii="Times New Roman" w:hAnsi="Times New Roman" w:cs="Times New Roman"/>
+          <w:sz w:val="22"/>
+          <w:szCs w:val="22"/>
+          <w:u w:val="single"/>
+        </w:rPr>
+      </w:pPr>
+      <w:r>
+        <w:rPr>
+          <w:rFonts w:ascii="Times New Roman" w:hAnsi="Times New Roman" w:cs="Times New Roman"/>
+          <w:sz w:val="22"/>
+          <w:szCs w:val="22"/>
+          <w:u w:val="single"/>
+        </w:rPr>
+        <w:t>CONSULTAS A HERRAMIENTAS DE IA</w:t>
       </w:r>
     </w:p>
     <w:p>
@@ -1260,7 +1162,6 @@
           <w:sz w:val="22"/>
           <w:szCs w:val="22"/>
         </w:rPr>
-        <w:lastRenderedPageBreak/>
         <w:t>Solicitud de grafico BPMN</w:t>
       </w:r>
       <w:r>
@@ -1354,7 +1255,6 @@
           <w:sz w:val="22"/>
           <w:szCs w:val="22"/>
         </w:rPr>
-        <w:lastRenderedPageBreak/>
         <w:drawing>
           <wp:inline distT="0" distB="0" distL="0" distR="0" wp14:anchorId="0080C19E" wp14:editId="6FB4556D">
             <wp:extent cx="5400040" cy="3550920"/>
@@ -1406,18 +1306,8 @@
           <w:sz w:val="22"/>
           <w:szCs w:val="22"/>
         </w:rPr>
-        <w:t xml:space="preserve">Se informa parámetros de código con </w:t>
-      </w:r>
-      <w:proofErr w:type="spellStart"/>
-      <w:r>
-        <w:rPr>
-          <w:rFonts w:ascii="Times New Roman" w:hAnsi="Times New Roman" w:cs="Times New Roman"/>
-          <w:sz w:val="22"/>
-          <w:szCs w:val="22"/>
-        </w:rPr>
-        <w:t>streamlit</w:t>
-      </w:r>
-      <w:proofErr w:type="spellEnd"/>
+        <w:t>Se informa parámetros de código con streamlit</w:t>
+      </w:r>
       <w:r>
         <w:rPr>
           <w:rFonts w:ascii="Times New Roman" w:hAnsi="Times New Roman" w:cs="Times New Roman"/>

</xml_diff>